<commit_message>
Completa diario de bordo e README
</commit_message>
<xml_diff>
--- a/diario_de_bordo.docx
+++ b/diario_de_bordo.docx
@@ -138,7 +138,6 @@
       </w:pPr>
       <w:r>
         <w:rPr>
-          <w:bCs/>
           <w:b/>
         </w:rPr>
         <w:t xml:space="preserve">Autor:</w:t>
@@ -156,7 +155,6 @@
       </w:pPr>
       <w:r>
         <w:rPr>
-          <w:bCs/>
           <w:b/>
         </w:rPr>
         <w:t xml:space="preserve">Professor(a):</w:t>
@@ -165,7 +163,7 @@
         <w:t xml:space="preserve"> </w:t>
       </w:r>
       <w:r>
-        <w:t xml:space="preserve">&lt;NOME_DO_PROFESSOR&gt;</w:t>
+        <w:t xml:space="preserve">&lt;HELCIO_PADILHA&gt;</w:t>
       </w:r>
     </w:p>
     <w:p>
@@ -174,7 +172,6 @@
       </w:pPr>
       <w:r>
         <w:rPr>
-          <w:bCs/>
           <w:b/>
         </w:rPr>
         <w:t xml:space="preserve">Repositório:</w:t>
@@ -182,18 +179,24 @@
       <w:r>
         <w:t xml:space="preserve"> </w:t>
       </w:r>
-      <w:r>
-        <w:t xml:space="preserve">&lt;LINK_DO_GITHUB&gt;</w:t>
-      </w:r>
-    </w:p>
-    <w:bookmarkStart w:id="20" w:name="quem-fez-o-quê"/>
+      <w:hyperlink r:id="rId20">
+        <w:r>
+          <w:rPr>
+            <w:rStyle w:val="Hyperlink"/>
+          </w:rPr>
+          <w:t xml:space="preserve">https://github.com/joaovt-ufpr/reservas-equipamentos</w:t>
+        </w:r>
+      </w:hyperlink>
+    </w:p>
     <w:p>
       <w:pPr>
         <w:pStyle w:val="Heading1"/>
       </w:pPr>
+      <w:bookmarkStart w:id="21" w:name="quem-fez-o-quê"/>
       <w:r>
         <w:t xml:space="preserve">1. Quem fez o quê</w:t>
       </w:r>
+      <w:bookmarkEnd w:id="21"/>
     </w:p>
     <w:p>
       <w:pPr>
@@ -203,15 +206,15 @@
         <w:t xml:space="preserve">O trabalho foi feito por mim, sozinho. Cuidei de todas as partes: o programa em C (menu, listas e funcionalidades), os testes, o README, este diário e o repositório no GitHub.</w:t>
       </w:r>
     </w:p>
-    <w:bookmarkEnd w:id="20"/>
-    <w:bookmarkStart w:id="21" w:name="ferramentas-que-usei"/>
     <w:p>
       <w:pPr>
         <w:pStyle w:val="Heading1"/>
       </w:pPr>
+      <w:bookmarkStart w:id="22" w:name="ferramentas-que-usei"/>
       <w:r>
         <w:t xml:space="preserve">2. Ferramentas que usei</w:t>
       </w:r>
+      <w:bookmarkEnd w:id="22"/>
     </w:p>
     <w:p>
       <w:pPr>
@@ -249,15 +252,15 @@
         <w:t xml:space="preserve">Usei o Claude (assistente de IA) como apoio: para montar a primeira versão do código, tirar dúvidas e organizar a documentação. Depois estudei o código para conseguir explicá-lo e testá-lo por conta própria.</w:t>
       </w:r>
     </w:p>
-    <w:bookmarkEnd w:id="21"/>
-    <w:bookmarkStart w:id="22" w:name="como-entendi-o-problema"/>
     <w:p>
       <w:pPr>
         <w:pStyle w:val="Heading1"/>
       </w:pPr>
+      <w:bookmarkStart w:id="23" w:name="como-entendi-o-problema"/>
       <w:r>
         <w:t xml:space="preserve">3. Como entendi o problema</w:t>
       </w:r>
+      <w:bookmarkEnd w:id="23"/>
     </w:p>
     <w:p>
       <w:pPr>
@@ -293,24 +296,25 @@
         <w:t xml:space="preserve">(o cabeçalho) com o nome do tipo e a contagem de equipamentos e reservas. Presa a essa ficha vêm duas listas: a dos equipamentos daquele tipo e a das reservas daquele tipo. Escolhi lista encadeada porque não sei quantos itens vão existir, e ela vai crescendo conforme eu cadastro.</w:t>
       </w:r>
     </w:p>
-    <w:bookmarkEnd w:id="22"/>
-    <w:bookmarkStart w:id="25" w:name="relato-semanal"/>
     <w:p>
       <w:pPr>
         <w:pStyle w:val="Heading1"/>
       </w:pPr>
+      <w:bookmarkStart w:id="24" w:name="relato-semanal"/>
       <w:r>
         <w:t xml:space="preserve">4. Relato semanal</w:t>
       </w:r>
-    </w:p>
-    <w:bookmarkStart w:id="23" w:name="semana-1-data_inicio-a-data_fim"/>
+      <w:bookmarkEnd w:id="24"/>
+    </w:p>
     <w:p>
       <w:pPr>
         <w:pStyle w:val="Heading2"/>
       </w:pPr>
-      <w:r>
-        <w:t xml:space="preserve">Semana 1 — &lt;DATA_INICIO&gt; a &lt;DATA_FIM&gt;</w:t>
-      </w:r>
+      <w:bookmarkStart w:id="25" w:name="semana-1"/>
+      <w:r>
+        <w:t xml:space="preserve">Semana 1 —</w:t>
+      </w:r>
+      <w:bookmarkEnd w:id="25"/>
     </w:p>
     <w:p>
       <w:pPr>
@@ -318,7 +322,6 @@
       </w:pPr>
       <w:r>
         <w:rPr>
-          <w:bCs/>
           <w:b/>
         </w:rPr>
         <w:t xml:space="preserve">O que fiz</w:t>
@@ -450,7 +453,6 @@
       </w:pPr>
       <w:r>
         <w:rPr>
-          <w:bCs/>
           <w:b/>
         </w:rPr>
         <w:t xml:space="preserve">Dificuldades e como resolvi</w:t>
@@ -525,7 +527,6 @@
       </w:pPr>
       <w:r>
         <w:rPr>
-          <w:bCs/>
           <w:b/>
         </w:rPr>
         <w:t xml:space="preserve">Uma parte do código explicada com minhas palavras</w:t>
@@ -565,61 +566,46 @@
         <w:rPr>
           <w:rStyle w:val="NormalTok"/>
         </w:rPr>
-        <w:t xml:space="preserve"> </w:t>
-      </w:r>
-      <w:r>
-        <w:rPr>
-          <w:rStyle w:val="OperatorTok"/>
-        </w:rPr>
-        <w:t xml:space="preserve">(</w:t>
+        <w:t xml:space="preserve"> (cab-&gt;equipamentos == NULL) {</w:t>
+      </w:r>
+      <w:r>
+        <w:br/>
       </w:r>
       <w:r>
         <w:rPr>
           <w:rStyle w:val="NormalTok"/>
         </w:rPr>
-        <w:t xml:space="preserve">cab</w:t>
-      </w:r>
-      <w:r>
-        <w:rPr>
-          <w:rStyle w:val="OperatorTok"/>
-        </w:rPr>
-        <w:t xml:space="preserve">-&gt;</w:t>
+        <w:t xml:space="preserve">    cab-&gt;equipamentos = novo;</w:t>
+      </w:r>
+      <w:r>
+        <w:br/>
       </w:r>
       <w:r>
         <w:rPr>
           <w:rStyle w:val="NormalTok"/>
         </w:rPr>
-        <w:t xml:space="preserve">equipamentos </w:t>
-      </w:r>
-      <w:r>
-        <w:rPr>
-          <w:rStyle w:val="OperatorTok"/>
-        </w:rPr>
-        <w:t xml:space="preserve">==</w:t>
+        <w:t xml:space="preserve">} </w:t>
+      </w:r>
+      <w:r>
+        <w:rPr>
+          <w:rStyle w:val="ControlFlowTok"/>
+        </w:rPr>
+        <w:t xml:space="preserve">else</w:t>
       </w:r>
       <w:r>
         <w:rPr>
           <w:rStyle w:val="NormalTok"/>
         </w:rPr>
-        <w:t xml:space="preserve"> NULL</w:t>
-      </w:r>
-      <w:r>
-        <w:rPr>
-          <w:rStyle w:val="OperatorTok"/>
-        </w:rPr>
-        <w:t xml:space="preserve">)</w:t>
+        <w:t xml:space="preserve"> {</w:t>
+      </w:r>
+      <w:r>
+        <w:br/>
       </w:r>
       <w:r>
         <w:rPr>
           <w:rStyle w:val="NormalTok"/>
         </w:rPr>
-        <w:t xml:space="preserve"> </w:t>
-      </w:r>
-      <w:r>
-        <w:rPr>
-          <w:rStyle w:val="OperatorTok"/>
-        </w:rPr>
-        <w:t xml:space="preserve">{</w:t>
+        <w:t xml:space="preserve">    Equipamento *e = cab-&gt;equipamentos;</w:t>
       </w:r>
       <w:r>
         <w:br/>
@@ -628,298 +614,55 @@
         <w:rPr>
           <w:rStyle w:val="NormalTok"/>
         </w:rPr>
-        <w:t xml:space="preserve">    cab</w:t>
-      </w:r>
-      <w:r>
-        <w:rPr>
-          <w:rStyle w:val="OperatorTok"/>
-        </w:rPr>
-        <w:t xml:space="preserve">-&gt;</w:t>
+        <w:t xml:space="preserve">    </w:t>
+      </w:r>
+      <w:r>
+        <w:rPr>
+          <w:rStyle w:val="ControlFlowTok"/>
+        </w:rPr>
+        <w:t xml:space="preserve">while</w:t>
       </w:r>
       <w:r>
         <w:rPr>
           <w:rStyle w:val="NormalTok"/>
         </w:rPr>
-        <w:t xml:space="preserve">equipamentos </w:t>
-      </w:r>
-      <w:r>
-        <w:rPr>
-          <w:rStyle w:val="OperatorTok"/>
-        </w:rPr>
-        <w:t xml:space="preserve">=</w:t>
+        <w:t xml:space="preserve"> (e-&gt;prox != NULL)</w:t>
+      </w:r>
+      <w:r>
+        <w:br/>
       </w:r>
       <w:r>
         <w:rPr>
           <w:rStyle w:val="NormalTok"/>
         </w:rPr>
-        <w:t xml:space="preserve"> novo</w:t>
-      </w:r>
-      <w:r>
-        <w:rPr>
-          <w:rStyle w:val="OperatorTok"/>
-        </w:rPr>
-        <w:t xml:space="preserve">;</w:t>
+        <w:t xml:space="preserve">        e = e-&gt;prox;</w:t>
       </w:r>
       <w:r>
         <w:br/>
       </w:r>
       <w:r>
         <w:rPr>
-          <w:rStyle w:val="OperatorTok"/>
+          <w:rStyle w:val="NormalTok"/>
+        </w:rPr>
+        <w:t xml:space="preserve">    e-&gt;prox = novo;</w:t>
+      </w:r>
+      <w:r>
+        <w:br/>
+      </w:r>
+      <w:r>
+        <w:rPr>
+          <w:rStyle w:val="NormalTok"/>
         </w:rPr>
         <w:t xml:space="preserve">}</w:t>
       </w:r>
       <w:r>
+        <w:br/>
+      </w:r>
+      <w:r>
         <w:rPr>
           <w:rStyle w:val="NormalTok"/>
         </w:rPr>
-        <w:t xml:space="preserve"> </w:t>
-      </w:r>
-      <w:r>
-        <w:rPr>
-          <w:rStyle w:val="ControlFlowTok"/>
-        </w:rPr>
-        <w:t xml:space="preserve">else</w:t>
-      </w:r>
-      <w:r>
-        <w:rPr>
-          <w:rStyle w:val="NormalTok"/>
-        </w:rPr>
-        <w:t xml:space="preserve"> </w:t>
-      </w:r>
-      <w:r>
-        <w:rPr>
-          <w:rStyle w:val="OperatorTok"/>
-        </w:rPr>
-        <w:t xml:space="preserve">{</w:t>
-      </w:r>
-      <w:r>
-        <w:br/>
-      </w:r>
-      <w:r>
-        <w:rPr>
-          <w:rStyle w:val="NormalTok"/>
-        </w:rPr>
-        <w:t xml:space="preserve">    Equipamento </w:t>
-      </w:r>
-      <w:r>
-        <w:rPr>
-          <w:rStyle w:val="OperatorTok"/>
-        </w:rPr>
-        <w:t xml:space="preserve">*</w:t>
-      </w:r>
-      <w:r>
-        <w:rPr>
-          <w:rStyle w:val="NormalTok"/>
-        </w:rPr>
-        <w:t xml:space="preserve">e </w:t>
-      </w:r>
-      <w:r>
-        <w:rPr>
-          <w:rStyle w:val="OperatorTok"/>
-        </w:rPr>
-        <w:t xml:space="preserve">=</w:t>
-      </w:r>
-      <w:r>
-        <w:rPr>
-          <w:rStyle w:val="NormalTok"/>
-        </w:rPr>
-        <w:t xml:space="preserve"> cab</w:t>
-      </w:r>
-      <w:r>
-        <w:rPr>
-          <w:rStyle w:val="OperatorTok"/>
-        </w:rPr>
-        <w:t xml:space="preserve">-&gt;</w:t>
-      </w:r>
-      <w:r>
-        <w:rPr>
-          <w:rStyle w:val="NormalTok"/>
-        </w:rPr>
-        <w:t xml:space="preserve">equipamentos</w:t>
-      </w:r>
-      <w:r>
-        <w:rPr>
-          <w:rStyle w:val="OperatorTok"/>
-        </w:rPr>
-        <w:t xml:space="preserve">;</w:t>
-      </w:r>
-      <w:r>
-        <w:br/>
-      </w:r>
-      <w:r>
-        <w:rPr>
-          <w:rStyle w:val="NormalTok"/>
-        </w:rPr>
-        <w:t xml:space="preserve">    </w:t>
-      </w:r>
-      <w:r>
-        <w:rPr>
-          <w:rStyle w:val="ControlFlowTok"/>
-        </w:rPr>
-        <w:t xml:space="preserve">while</w:t>
-      </w:r>
-      <w:r>
-        <w:rPr>
-          <w:rStyle w:val="NormalTok"/>
-        </w:rPr>
-        <w:t xml:space="preserve"> </w:t>
-      </w:r>
-      <w:r>
-        <w:rPr>
-          <w:rStyle w:val="OperatorTok"/>
-        </w:rPr>
-        <w:t xml:space="preserve">(</w:t>
-      </w:r>
-      <w:r>
-        <w:rPr>
-          <w:rStyle w:val="NormalTok"/>
-        </w:rPr>
-        <w:t xml:space="preserve">e</w:t>
-      </w:r>
-      <w:r>
-        <w:rPr>
-          <w:rStyle w:val="OperatorTok"/>
-        </w:rPr>
-        <w:t xml:space="preserve">-&gt;</w:t>
-      </w:r>
-      <w:r>
-        <w:rPr>
-          <w:rStyle w:val="NormalTok"/>
-        </w:rPr>
-        <w:t xml:space="preserve">prox </w:t>
-      </w:r>
-      <w:r>
-        <w:rPr>
-          <w:rStyle w:val="OperatorTok"/>
-        </w:rPr>
-        <w:t xml:space="preserve">!=</w:t>
-      </w:r>
-      <w:r>
-        <w:rPr>
-          <w:rStyle w:val="NormalTok"/>
-        </w:rPr>
-        <w:t xml:space="preserve"> NULL</w:t>
-      </w:r>
-      <w:r>
-        <w:rPr>
-          <w:rStyle w:val="OperatorTok"/>
-        </w:rPr>
-        <w:t xml:space="preserve">)</w:t>
-      </w:r>
-      <w:r>
-        <w:br/>
-      </w:r>
-      <w:r>
-        <w:rPr>
-          <w:rStyle w:val="NormalTok"/>
-        </w:rPr>
-        <w:t xml:space="preserve">        e </w:t>
-      </w:r>
-      <w:r>
-        <w:rPr>
-          <w:rStyle w:val="OperatorTok"/>
-        </w:rPr>
-        <w:t xml:space="preserve">=</w:t>
-      </w:r>
-      <w:r>
-        <w:rPr>
-          <w:rStyle w:val="NormalTok"/>
-        </w:rPr>
-        <w:t xml:space="preserve"> e</w:t>
-      </w:r>
-      <w:r>
-        <w:rPr>
-          <w:rStyle w:val="OperatorTok"/>
-        </w:rPr>
-        <w:t xml:space="preserve">-&gt;</w:t>
-      </w:r>
-      <w:r>
-        <w:rPr>
-          <w:rStyle w:val="NormalTok"/>
-        </w:rPr>
-        <w:t xml:space="preserve">prox</w:t>
-      </w:r>
-      <w:r>
-        <w:rPr>
-          <w:rStyle w:val="OperatorTok"/>
-        </w:rPr>
-        <w:t xml:space="preserve">;</w:t>
-      </w:r>
-      <w:r>
-        <w:br/>
-      </w:r>
-      <w:r>
-        <w:rPr>
-          <w:rStyle w:val="NormalTok"/>
-        </w:rPr>
-        <w:t xml:space="preserve">    e</w:t>
-      </w:r>
-      <w:r>
-        <w:rPr>
-          <w:rStyle w:val="OperatorTok"/>
-        </w:rPr>
-        <w:t xml:space="preserve">-&gt;</w:t>
-      </w:r>
-      <w:r>
-        <w:rPr>
-          <w:rStyle w:val="NormalTok"/>
-        </w:rPr>
-        <w:t xml:space="preserve">prox </w:t>
-      </w:r>
-      <w:r>
-        <w:rPr>
-          <w:rStyle w:val="OperatorTok"/>
-        </w:rPr>
-        <w:t xml:space="preserve">=</w:t>
-      </w:r>
-      <w:r>
-        <w:rPr>
-          <w:rStyle w:val="NormalTok"/>
-        </w:rPr>
-        <w:t xml:space="preserve"> novo</w:t>
-      </w:r>
-      <w:r>
-        <w:rPr>
-          <w:rStyle w:val="OperatorTok"/>
-        </w:rPr>
-        <w:t xml:space="preserve">;</w:t>
-      </w:r>
-      <w:r>
-        <w:br/>
-      </w:r>
-      <w:r>
-        <w:rPr>
-          <w:rStyle w:val="OperatorTok"/>
-        </w:rPr>
-        <w:t xml:space="preserve">}</w:t>
-      </w:r>
-      <w:r>
-        <w:br/>
-      </w:r>
-      <w:r>
-        <w:rPr>
-          <w:rStyle w:val="NormalTok"/>
-        </w:rPr>
-        <w:t xml:space="preserve">cab</w:t>
-      </w:r>
-      <w:r>
-        <w:rPr>
-          <w:rStyle w:val="OperatorTok"/>
-        </w:rPr>
-        <w:t xml:space="preserve">-&gt;</w:t>
-      </w:r>
-      <w:r>
-        <w:rPr>
-          <w:rStyle w:val="NormalTok"/>
-        </w:rPr>
-        <w:t xml:space="preserve">qtdEquipamentos</w:t>
-      </w:r>
-      <w:r>
-        <w:rPr>
-          <w:rStyle w:val="OperatorTok"/>
-        </w:rPr>
-        <w:t xml:space="preserve">++;</w:t>
+        <w:t xml:space="preserve">cab-&gt;qtdEquipamentos++;</w:t>
       </w:r>
     </w:p>
     <w:p>
@@ -948,15 +691,15 @@
         <w:t xml:space="preserve">de um em um até chegar no último (o que não aponta para ninguém). Aí ligo o novo equipamento no fim. No final somo 1 no contador que fica no cabeçalho, assim sei quantos equipamentos o tipo tem sem precisar contar de novo.</w:t>
       </w:r>
     </w:p>
-    <w:bookmarkEnd w:id="23"/>
-    <w:bookmarkStart w:id="24" w:name="semana-2-data_inicio-a-data_fim"/>
     <w:p>
       <w:pPr>
         <w:pStyle w:val="Heading2"/>
       </w:pPr>
-      <w:r>
-        <w:t xml:space="preserve">Semana 2 — &lt;DATA_INICIO&gt; a &lt;DATA_FIM&gt;</w:t>
-      </w:r>
+      <w:bookmarkStart w:id="26" w:name="semana-2"/>
+      <w:r>
+        <w:t xml:space="preserve">Semana 2 —</w:t>
+      </w:r>
+      <w:bookmarkEnd w:id="26"/>
     </w:p>
     <w:p>
       <w:pPr>
@@ -964,7 +707,6 @@
       </w:pPr>
       <w:r>
         <w:rPr>
-          <w:bCs/>
           <w:b/>
         </w:rPr>
         <w:t xml:space="preserve">O que fiz</w:t>
@@ -1036,7 +778,6 @@
       </w:pPr>
       <w:r>
         <w:rPr>
-          <w:bCs/>
           <w:b/>
         </w:rPr>
         <w:t xml:space="preserve">Dificuldades e como resolvi</w:t>
@@ -1072,7 +813,6 @@
       </w:pPr>
       <w:r>
         <w:rPr>
-          <w:bCs/>
           <w:b/>
         </w:rPr>
         <w:t xml:space="preserve">Uma parte do código explicada com minhas palavras</w:t>
@@ -1106,454 +846,130 @@
         <w:rPr>
           <w:rStyle w:val="NormalTok"/>
         </w:rPr>
-        <w:t xml:space="preserve">Reserva </w:t>
-      </w:r>
-      <w:r>
-        <w:rPr>
-          <w:rStyle w:val="OperatorTok"/>
-        </w:rPr>
-        <w:t xml:space="preserve">*</w:t>
+        <w:t xml:space="preserve">Reserva *r = cab-&gt;reservas;</w:t>
+      </w:r>
+      <w:r>
+        <w:br/>
+      </w:r>
+      <w:r>
+        <w:rPr>
+          <w:rStyle w:val="ControlFlowTok"/>
+        </w:rPr>
+        <w:t xml:space="preserve">while</w:t>
       </w:r>
       <w:r>
         <w:rPr>
           <w:rStyle w:val="NormalTok"/>
         </w:rPr>
-        <w:t xml:space="preserve">r </w:t>
-      </w:r>
-      <w:r>
-        <w:rPr>
-          <w:rStyle w:val="OperatorTok"/>
-        </w:rPr>
-        <w:t xml:space="preserve">=</w:t>
+        <w:t xml:space="preserve"> (r != NULL) {</w:t>
+      </w:r>
+      <w:r>
+        <w:br/>
       </w:r>
       <w:r>
         <w:rPr>
           <w:rStyle w:val="NormalTok"/>
         </w:rPr>
-        <w:t xml:space="preserve"> cab</w:t>
-      </w:r>
-      <w:r>
-        <w:rPr>
-          <w:rStyle w:val="OperatorTok"/>
-        </w:rPr>
-        <w:t xml:space="preserve">-&gt;</w:t>
+        <w:t xml:space="preserve">    </w:t>
+      </w:r>
+      <w:r>
+        <w:rPr>
+          <w:rStyle w:val="ControlFlowTok"/>
+        </w:rPr>
+        <w:t xml:space="preserve">if</w:t>
       </w:r>
       <w:r>
         <w:rPr>
           <w:rStyle w:val="NormalTok"/>
         </w:rPr>
-        <w:t xml:space="preserve">reservas</w:t>
-      </w:r>
-      <w:r>
-        <w:rPr>
-          <w:rStyle w:val="OperatorTok"/>
-        </w:rPr>
-        <w:t xml:space="preserve">;</w:t>
+        <w:t xml:space="preserve"> (r-&gt;ativa &amp;&amp; r-&gt;codigoEquip == codigo &amp;&amp;</w:t>
       </w:r>
       <w:r>
         <w:br/>
       </w:r>
       <w:r>
         <w:rPr>
+          <w:rStyle w:val="NormalTok"/>
+        </w:rPr>
+        <w:t xml:space="preserve">        strcmp(r-&gt;data, data) == </w:t>
+      </w:r>
+      <w:r>
+        <w:rPr>
+          <w:rStyle w:val="DecValTok"/>
+        </w:rPr>
+        <w:t xml:space="preserve">0</w:t>
+      </w:r>
+      <w:r>
+        <w:rPr>
+          <w:rStyle w:val="NormalTok"/>
+        </w:rPr>
+        <w:t xml:space="preserve"> &amp;&amp; strcmp(r-&gt;hora, hora) == </w:t>
+      </w:r>
+      <w:r>
+        <w:rPr>
+          <w:rStyle w:val="DecValTok"/>
+        </w:rPr>
+        <w:t xml:space="preserve">0</w:t>
+      </w:r>
+      <w:r>
+        <w:rPr>
+          <w:rStyle w:val="NormalTok"/>
+        </w:rPr>
+        <w:t xml:space="preserve">)</w:t>
+      </w:r>
+      <w:r>
+        <w:br/>
+      </w:r>
+      <w:r>
+        <w:rPr>
+          <w:rStyle w:val="NormalTok"/>
+        </w:rPr>
+        <w:t xml:space="preserve">        </w:t>
+      </w:r>
+      <w:r>
+        <w:rPr>
           <w:rStyle w:val="ControlFlowTok"/>
         </w:rPr>
-        <w:t xml:space="preserve">while</w:t>
+        <w:t xml:space="preserve">return</w:t>
       </w:r>
       <w:r>
         <w:rPr>
           <w:rStyle w:val="NormalTok"/>
         </w:rPr>
-        <w:t xml:space="preserve"> </w:t>
-      </w:r>
-      <w:r>
-        <w:rPr>
-          <w:rStyle w:val="OperatorTok"/>
-        </w:rPr>
-        <w:t xml:space="preserve">(</w:t>
+        <w:t xml:space="preserve"> r;</w:t>
+      </w:r>
+      <w:r>
+        <w:br/>
       </w:r>
       <w:r>
         <w:rPr>
           <w:rStyle w:val="NormalTok"/>
         </w:rPr>
-        <w:t xml:space="preserve">r </w:t>
-      </w:r>
-      <w:r>
-        <w:rPr>
-          <w:rStyle w:val="OperatorTok"/>
-        </w:rPr>
-        <w:t xml:space="preserve">!=</w:t>
+        <w:t xml:space="preserve">    r = r-&gt;prox;</w:t>
+      </w:r>
+      <w:r>
+        <w:br/>
       </w:r>
       <w:r>
         <w:rPr>
           <w:rStyle w:val="NormalTok"/>
         </w:rPr>
-        <w:t xml:space="preserve"> NULL</w:t>
-      </w:r>
-      <w:r>
-        <w:rPr>
-          <w:rStyle w:val="OperatorTok"/>
-        </w:rPr>
-        <w:t xml:space="preserve">)</w:t>
+        <w:t xml:space="preserve">}</w:t>
+      </w:r>
+      <w:r>
+        <w:br/>
+      </w:r>
+      <w:r>
+        <w:rPr>
+          <w:rStyle w:val="ControlFlowTok"/>
+        </w:rPr>
+        <w:t xml:space="preserve">return</w:t>
       </w:r>
       <w:r>
         <w:rPr>
           <w:rStyle w:val="NormalTok"/>
         </w:rPr>
-        <w:t xml:space="preserve"> </w:t>
-      </w:r>
-      <w:r>
-        <w:rPr>
-          <w:rStyle w:val="OperatorTok"/>
-        </w:rPr>
-        <w:t xml:space="preserve">{</w:t>
-      </w:r>
-      <w:r>
-        <w:br/>
-      </w:r>
-      <w:r>
-        <w:rPr>
-          <w:rStyle w:val="NormalTok"/>
-        </w:rPr>
-        <w:t xml:space="preserve">    </w:t>
-      </w:r>
-      <w:r>
-        <w:rPr>
-          <w:rStyle w:val="ControlFlowTok"/>
-        </w:rPr>
-        <w:t xml:space="preserve">if</w:t>
-      </w:r>
-      <w:r>
-        <w:rPr>
-          <w:rStyle w:val="NormalTok"/>
-        </w:rPr>
-        <w:t xml:space="preserve"> </w:t>
-      </w:r>
-      <w:r>
-        <w:rPr>
-          <w:rStyle w:val="OperatorTok"/>
-        </w:rPr>
-        <w:t xml:space="preserve">(</w:t>
-      </w:r>
-      <w:r>
-        <w:rPr>
-          <w:rStyle w:val="NormalTok"/>
-        </w:rPr>
-        <w:t xml:space="preserve">r</w:t>
-      </w:r>
-      <w:r>
-        <w:rPr>
-          <w:rStyle w:val="OperatorTok"/>
-        </w:rPr>
-        <w:t xml:space="preserve">-&gt;</w:t>
-      </w:r>
-      <w:r>
-        <w:rPr>
-          <w:rStyle w:val="NormalTok"/>
-        </w:rPr>
-        <w:t xml:space="preserve">ativa </w:t>
-      </w:r>
-      <w:r>
-        <w:rPr>
-          <w:rStyle w:val="OperatorTok"/>
-        </w:rPr>
-        <w:t xml:space="preserve">&amp;&amp;</w:t>
-      </w:r>
-      <w:r>
-        <w:rPr>
-          <w:rStyle w:val="NormalTok"/>
-        </w:rPr>
-        <w:t xml:space="preserve"> r</w:t>
-      </w:r>
-      <w:r>
-        <w:rPr>
-          <w:rStyle w:val="OperatorTok"/>
-        </w:rPr>
-        <w:t xml:space="preserve">-&gt;</w:t>
-      </w:r>
-      <w:r>
-        <w:rPr>
-          <w:rStyle w:val="NormalTok"/>
-        </w:rPr>
-        <w:t xml:space="preserve">codigoEquip </w:t>
-      </w:r>
-      <w:r>
-        <w:rPr>
-          <w:rStyle w:val="OperatorTok"/>
-        </w:rPr>
-        <w:t xml:space="preserve">==</w:t>
-      </w:r>
-      <w:r>
-        <w:rPr>
-          <w:rStyle w:val="NormalTok"/>
-        </w:rPr>
-        <w:t xml:space="preserve"> codigo </w:t>
-      </w:r>
-      <w:r>
-        <w:rPr>
-          <w:rStyle w:val="OperatorTok"/>
-        </w:rPr>
-        <w:t xml:space="preserve">&amp;&amp;</w:t>
-      </w:r>
-      <w:r>
-        <w:br/>
-      </w:r>
-      <w:r>
-        <w:rPr>
-          <w:rStyle w:val="NormalTok"/>
-        </w:rPr>
-        <w:t xml:space="preserve">        strcmp</w:t>
-      </w:r>
-      <w:r>
-        <w:rPr>
-          <w:rStyle w:val="OperatorTok"/>
-        </w:rPr>
-        <w:t xml:space="preserve">(</w:t>
-      </w:r>
-      <w:r>
-        <w:rPr>
-          <w:rStyle w:val="NormalTok"/>
-        </w:rPr>
-        <w:t xml:space="preserve">r</w:t>
-      </w:r>
-      <w:r>
-        <w:rPr>
-          <w:rStyle w:val="OperatorTok"/>
-        </w:rPr>
-        <w:t xml:space="preserve">-&gt;</w:t>
-      </w:r>
-      <w:r>
-        <w:rPr>
-          <w:rStyle w:val="NormalTok"/>
-        </w:rPr>
-        <w:t xml:space="preserve">data</w:t>
-      </w:r>
-      <w:r>
-        <w:rPr>
-          <w:rStyle w:val="OperatorTok"/>
-        </w:rPr>
-        <w:t xml:space="preserve">,</w:t>
-      </w:r>
-      <w:r>
-        <w:rPr>
-          <w:rStyle w:val="NormalTok"/>
-        </w:rPr>
-        <w:t xml:space="preserve"> data</w:t>
-      </w:r>
-      <w:r>
-        <w:rPr>
-          <w:rStyle w:val="OperatorTok"/>
-        </w:rPr>
-        <w:t xml:space="preserve">)</w:t>
-      </w:r>
-      <w:r>
-        <w:rPr>
-          <w:rStyle w:val="NormalTok"/>
-        </w:rPr>
-        <w:t xml:space="preserve"> </w:t>
-      </w:r>
-      <w:r>
-        <w:rPr>
-          <w:rStyle w:val="OperatorTok"/>
-        </w:rPr>
-        <w:t xml:space="preserve">==</w:t>
-      </w:r>
-      <w:r>
-        <w:rPr>
-          <w:rStyle w:val="NormalTok"/>
-        </w:rPr>
-        <w:t xml:space="preserve"> </w:t>
-      </w:r>
-      <w:r>
-        <w:rPr>
-          <w:rStyle w:val="DecValTok"/>
-        </w:rPr>
-        <w:t xml:space="preserve">0</w:t>
-      </w:r>
-      <w:r>
-        <w:rPr>
-          <w:rStyle w:val="NormalTok"/>
-        </w:rPr>
-        <w:t xml:space="preserve"> </w:t>
-      </w:r>
-      <w:r>
-        <w:rPr>
-          <w:rStyle w:val="OperatorTok"/>
-        </w:rPr>
-        <w:t xml:space="preserve">&amp;&amp;</w:t>
-      </w:r>
-      <w:r>
-        <w:rPr>
-          <w:rStyle w:val="NormalTok"/>
-        </w:rPr>
-        <w:t xml:space="preserve"> strcmp</w:t>
-      </w:r>
-      <w:r>
-        <w:rPr>
-          <w:rStyle w:val="OperatorTok"/>
-        </w:rPr>
-        <w:t xml:space="preserve">(</w:t>
-      </w:r>
-      <w:r>
-        <w:rPr>
-          <w:rStyle w:val="NormalTok"/>
-        </w:rPr>
-        <w:t xml:space="preserve">r</w:t>
-      </w:r>
-      <w:r>
-        <w:rPr>
-          <w:rStyle w:val="OperatorTok"/>
-        </w:rPr>
-        <w:t xml:space="preserve">-&gt;</w:t>
-      </w:r>
-      <w:r>
-        <w:rPr>
-          <w:rStyle w:val="NormalTok"/>
-        </w:rPr>
-        <w:t xml:space="preserve">hora</w:t>
-      </w:r>
-      <w:r>
-        <w:rPr>
-          <w:rStyle w:val="OperatorTok"/>
-        </w:rPr>
-        <w:t xml:space="preserve">,</w:t>
-      </w:r>
-      <w:r>
-        <w:rPr>
-          <w:rStyle w:val="NormalTok"/>
-        </w:rPr>
-        <w:t xml:space="preserve"> hora</w:t>
-      </w:r>
-      <w:r>
-        <w:rPr>
-          <w:rStyle w:val="OperatorTok"/>
-        </w:rPr>
-        <w:t xml:space="preserve">)</w:t>
-      </w:r>
-      <w:r>
-        <w:rPr>
-          <w:rStyle w:val="NormalTok"/>
-        </w:rPr>
-        <w:t xml:space="preserve"> </w:t>
-      </w:r>
-      <w:r>
-        <w:rPr>
-          <w:rStyle w:val="OperatorTok"/>
-        </w:rPr>
-        <w:t xml:space="preserve">==</w:t>
-      </w:r>
-      <w:r>
-        <w:rPr>
-          <w:rStyle w:val="NormalTok"/>
-        </w:rPr>
-        <w:t xml:space="preserve"> </w:t>
-      </w:r>
-      <w:r>
-        <w:rPr>
-          <w:rStyle w:val="DecValTok"/>
-        </w:rPr>
-        <w:t xml:space="preserve">0</w:t>
-      </w:r>
-      <w:r>
-        <w:rPr>
-          <w:rStyle w:val="OperatorTok"/>
-        </w:rPr>
-        <w:t xml:space="preserve">)</w:t>
-      </w:r>
-      <w:r>
-        <w:br/>
-      </w:r>
-      <w:r>
-        <w:rPr>
-          <w:rStyle w:val="NormalTok"/>
-        </w:rPr>
-        <w:t xml:space="preserve">        </w:t>
-      </w:r>
-      <w:r>
-        <w:rPr>
-          <w:rStyle w:val="ControlFlowTok"/>
-        </w:rPr>
-        <w:t xml:space="preserve">return</w:t>
-      </w:r>
-      <w:r>
-        <w:rPr>
-          <w:rStyle w:val="NormalTok"/>
-        </w:rPr>
-        <w:t xml:space="preserve"> r</w:t>
-      </w:r>
-      <w:r>
-        <w:rPr>
-          <w:rStyle w:val="OperatorTok"/>
-        </w:rPr>
-        <w:t xml:space="preserve">;</w:t>
-      </w:r>
-      <w:r>
-        <w:br/>
-      </w:r>
-      <w:r>
-        <w:rPr>
-          <w:rStyle w:val="NormalTok"/>
-        </w:rPr>
-        <w:t xml:space="preserve">    r </w:t>
-      </w:r>
-      <w:r>
-        <w:rPr>
-          <w:rStyle w:val="OperatorTok"/>
-        </w:rPr>
-        <w:t xml:space="preserve">=</w:t>
-      </w:r>
-      <w:r>
-        <w:rPr>
-          <w:rStyle w:val="NormalTok"/>
-        </w:rPr>
-        <w:t xml:space="preserve"> r</w:t>
-      </w:r>
-      <w:r>
-        <w:rPr>
-          <w:rStyle w:val="OperatorTok"/>
-        </w:rPr>
-        <w:t xml:space="preserve">-&gt;</w:t>
-      </w:r>
-      <w:r>
-        <w:rPr>
-          <w:rStyle w:val="NormalTok"/>
-        </w:rPr>
-        <w:t xml:space="preserve">prox</w:t>
-      </w:r>
-      <w:r>
-        <w:rPr>
-          <w:rStyle w:val="OperatorTok"/>
-        </w:rPr>
-        <w:t xml:space="preserve">;</w:t>
-      </w:r>
-      <w:r>
-        <w:br/>
-      </w:r>
-      <w:r>
-        <w:rPr>
-          <w:rStyle w:val="OperatorTok"/>
-        </w:rPr>
-        <w:t xml:space="preserve">}</w:t>
-      </w:r>
-      <w:r>
-        <w:br/>
-      </w:r>
-      <w:r>
-        <w:rPr>
-          <w:rStyle w:val="ControlFlowTok"/>
-        </w:rPr>
-        <w:t xml:space="preserve">return</w:t>
-      </w:r>
-      <w:r>
-        <w:rPr>
-          <w:rStyle w:val="NormalTok"/>
-        </w:rPr>
-        <w:t xml:space="preserve"> NULL</w:t>
-      </w:r>
-      <w:r>
-        <w:rPr>
-          <w:rStyle w:val="OperatorTok"/>
-        </w:rPr>
-        <w:t xml:space="preserve">;</w:t>
+        <w:t xml:space="preserve"> NULL;</w:t>
       </w:r>
     </w:p>
     <w:p>
@@ -1606,16 +1022,15 @@
         <w:t xml:space="preserve">. Como só olho reservas ativas, um horário cancelado pode ser reservado de novo. Uso a mesma função para achar a reserva que o usuário quer cancelar.</w:t>
       </w:r>
     </w:p>
-    <w:bookmarkEnd w:id="24"/>
-    <w:bookmarkEnd w:id="25"/>
-    <w:bookmarkStart w:id="26" w:name="resultado"/>
     <w:p>
       <w:pPr>
         <w:pStyle w:val="Heading1"/>
       </w:pPr>
+      <w:bookmarkStart w:id="27" w:name="resultado"/>
       <w:r>
         <w:t xml:space="preserve">5. Resultado</w:t>
       </w:r>
+      <w:bookmarkEnd w:id="27"/>
     </w:p>
     <w:p>
       <w:pPr>
@@ -1625,15 +1040,15 @@
         <w:t xml:space="preserve">O programa faz as seis funcionalidades pedidas e foi testado com dados corretos e errados. Ele não salva os dados em arquivo (tudo some quando fecha) e só confere se a data está no formato DD/MM/AAAA.</w:t>
       </w:r>
     </w:p>
-    <w:bookmarkEnd w:id="26"/>
-    <w:bookmarkStart w:id="27" w:name="o-que-aprendi"/>
     <w:p>
       <w:pPr>
         <w:pStyle w:val="Heading1"/>
       </w:pPr>
+      <w:bookmarkStart w:id="28" w:name="o-que-aprendi"/>
       <w:r>
         <w:t xml:space="preserve">6. O que aprendi</w:t>
       </w:r>
+      <w:bookmarkEnd w:id="28"/>
     </w:p>
     <w:p>
       <w:pPr>
@@ -1643,7 +1058,6 @@
         <w:t xml:space="preserve">Aprendi como funciona uma lista encadeada: cada item aponta para o próximo, e para chegar ao fim é preciso andar item por item. Entendi para que serve o cabeçalho: ele guarda informações do grupo (nome do tipo e contadores) e o começo das listas, o que deixa o histórico separado por tipo. Vi que aqui a lista é melhor que um vetor porque não sei quantos equipamentos e reservas vão existir. Também aprendi que é melhor marcar a reserva como cancelada do que apagá-la, para não perder o histórico, e que é preciso liberar a memória no final do programa. Por fim, aprendi o básico de Git e GitHub para entregar o trabalho.</w:t>
       </w:r>
     </w:p>
-    <w:bookmarkEnd w:id="27"/>
     <w:sectPr/>
   </w:body>
 </w:document>
@@ -1675,14 +1089,17 @@
 <file path=word/numbering.xml><?xml version="1.0" encoding="utf-8"?>
 <w:numbering xmlns:w="http://schemas.openxmlformats.org/wordprocessingml/2006/main">
   <w:abstractNum w:abstractNumId="990">
-    <w:nsid w:val="A990"/>
+    <w:nsid w:val="2c1ae401"/>
     <w:multiLevelType w:val="multilevel"/>
     <w:lvl w:ilvl="0">
       <w:numFmt w:val="bullet"/>
       <w:lvlText w:val=" "/>
       <w:lvlJc w:val="left"/>
       <w:pPr>
-        <w:ind w:left="720" w:hanging="480"/>
+        <w:tabs>
+          <w:tab w:val="num" w:pos="0"/>
+        </w:tabs>
+        <w:ind w:left="480" w:hanging="480"/>
       </w:pPr>
     </w:lvl>
     <w:lvl w:ilvl="1">
@@ -1690,7 +1107,10 @@
       <w:lvlText w:val=" "/>
       <w:lvlJc w:val="left"/>
       <w:pPr>
-        <w:ind w:left="1440" w:hanging="480"/>
+        <w:tabs>
+          <w:tab w:val="num" w:pos="720"/>
+        </w:tabs>
+        <w:ind w:left="1200" w:hanging="480"/>
       </w:pPr>
     </w:lvl>
     <w:lvl w:ilvl="2">
@@ -1698,7 +1118,10 @@
       <w:lvlText w:val=" "/>
       <w:lvlJc w:val="left"/>
       <w:pPr>
-        <w:ind w:left="2160" w:hanging="480"/>
+        <w:tabs>
+          <w:tab w:val="num" w:pos="1440"/>
+        </w:tabs>
+        <w:ind w:left="1920" w:hanging="480"/>
       </w:pPr>
     </w:lvl>
     <w:lvl w:ilvl="3">
@@ -1706,7 +1129,10 @@
       <w:lvlText w:val=" "/>
       <w:lvlJc w:val="left"/>
       <w:pPr>
-        <w:ind w:left="2880" w:hanging="480"/>
+        <w:tabs>
+          <w:tab w:val="num" w:pos="2160"/>
+        </w:tabs>
+        <w:ind w:left="2640" w:hanging="480"/>
       </w:pPr>
     </w:lvl>
     <w:lvl w:ilvl="4">
@@ -1714,7 +1140,10 @@
       <w:lvlText w:val=" "/>
       <w:lvlJc w:val="left"/>
       <w:pPr>
-        <w:ind w:left="3600" w:hanging="480"/>
+        <w:tabs>
+          <w:tab w:val="num" w:pos="2880"/>
+        </w:tabs>
+        <w:ind w:left="3360" w:hanging="480"/>
       </w:pPr>
     </w:lvl>
     <w:lvl w:ilvl="5">
@@ -1722,7 +1151,10 @@
       <w:lvlText w:val=" "/>
       <w:lvlJc w:val="left"/>
       <w:pPr>
-        <w:ind w:left="4320" w:hanging="480"/>
+        <w:tabs>
+          <w:tab w:val="num" w:pos="3600"/>
+        </w:tabs>
+        <w:ind w:left="4080" w:hanging="480"/>
       </w:pPr>
     </w:lvl>
     <w:lvl w:ilvl="6">
@@ -1730,7 +1162,10 @@
       <w:lvlText w:val=" "/>
       <w:lvlJc w:val="left"/>
       <w:pPr>
-        <w:ind w:left="5040" w:hanging="480"/>
+        <w:tabs>
+          <w:tab w:val="num" w:pos="4320"/>
+        </w:tabs>
+        <w:ind w:left="4800" w:hanging="480"/>
       </w:pPr>
     </w:lvl>
     <w:lvl w:ilvl="7">
@@ -1738,7 +1173,10 @@
       <w:lvlText w:val=" "/>
       <w:lvlJc w:val="left"/>
       <w:pPr>
-        <w:ind w:left="5760" w:hanging="480"/>
+        <w:tabs>
+          <w:tab w:val="num" w:pos="5040"/>
+        </w:tabs>
+        <w:ind w:left="5520" w:hanging="480"/>
       </w:pPr>
     </w:lvl>
     <w:lvl w:ilvl="8">
@@ -1746,19 +1184,25 @@
       <w:lvlText w:val=" "/>
       <w:lvlJc w:val="left"/>
       <w:pPr>
-        <w:ind w:left="6480" w:hanging="480"/>
+        <w:tabs>
+          <w:tab w:val="num" w:pos="5760"/>
+        </w:tabs>
+        <w:ind w:left="6240" w:hanging="480"/>
       </w:pPr>
     </w:lvl>
   </w:abstractNum>
   <w:abstractNum w:abstractNumId="991">
-    <w:nsid w:val="A991"/>
+    <w:nsid w:val="ea454b4c"/>
     <w:multiLevelType w:val="multilevel"/>
     <w:lvl w:ilvl="0">
       <w:numFmt w:val="bullet"/>
       <w:lvlText w:val="•"/>
       <w:lvlJc w:val="left"/>
       <w:pPr>
-        <w:ind w:left="720" w:hanging="480"/>
+        <w:tabs>
+          <w:tab w:val="num" w:pos="0"/>
+        </w:tabs>
+        <w:ind w:left="480" w:hanging="480"/>
       </w:pPr>
     </w:lvl>
     <w:lvl w:ilvl="1">
@@ -1766,7 +1210,10 @@
       <w:lvlText w:val="–"/>
       <w:lvlJc w:val="left"/>
       <w:pPr>
-        <w:ind w:left="1440" w:hanging="480"/>
+        <w:tabs>
+          <w:tab w:val="num" w:pos="720"/>
+        </w:tabs>
+        <w:ind w:left="1200" w:hanging="480"/>
       </w:pPr>
     </w:lvl>
     <w:lvl w:ilvl="2">
@@ -1774,7 +1221,10 @@
       <w:lvlText w:val="•"/>
       <w:lvlJc w:val="left"/>
       <w:pPr>
-        <w:ind w:left="2160" w:hanging="480"/>
+        <w:tabs>
+          <w:tab w:val="num" w:pos="1440"/>
+        </w:tabs>
+        <w:ind w:left="1920" w:hanging="480"/>
       </w:pPr>
     </w:lvl>
     <w:lvl w:ilvl="3">
@@ -1782,7 +1232,10 @@
       <w:lvlText w:val="–"/>
       <w:lvlJc w:val="left"/>
       <w:pPr>
-        <w:ind w:left="2880" w:hanging="480"/>
+        <w:tabs>
+          <w:tab w:val="num" w:pos="2160"/>
+        </w:tabs>
+        <w:ind w:left="2640" w:hanging="480"/>
       </w:pPr>
     </w:lvl>
     <w:lvl w:ilvl="4">
@@ -1790,7 +1243,10 @@
       <w:lvlText w:val="•"/>
       <w:lvlJc w:val="left"/>
       <w:pPr>
-        <w:ind w:left="3600" w:hanging="480"/>
+        <w:tabs>
+          <w:tab w:val="num" w:pos="2880"/>
+        </w:tabs>
+        <w:ind w:left="3360" w:hanging="480"/>
       </w:pPr>
     </w:lvl>
     <w:lvl w:ilvl="5">
@@ -1798,7 +1254,10 @@
       <w:lvlText w:val="–"/>
       <w:lvlJc w:val="left"/>
       <w:pPr>
-        <w:ind w:left="4320" w:hanging="480"/>
+        <w:tabs>
+          <w:tab w:val="num" w:pos="3600"/>
+        </w:tabs>
+        <w:ind w:left="4080" w:hanging="480"/>
       </w:pPr>
     </w:lvl>
     <w:lvl w:ilvl="6">
@@ -1806,7 +1265,10 @@
       <w:lvlText w:val="•"/>
       <w:lvlJc w:val="left"/>
       <w:pPr>
-        <w:ind w:left="5040" w:hanging="480"/>
+        <w:tabs>
+          <w:tab w:val="num" w:pos="4320"/>
+        </w:tabs>
+        <w:ind w:left="4800" w:hanging="480"/>
       </w:pPr>
     </w:lvl>
     <w:lvl w:ilvl="7">
@@ -1814,7 +1276,10 @@
       <w:lvlText w:val="–"/>
       <w:lvlJc w:val="left"/>
       <w:pPr>
-        <w:ind w:left="5760" w:hanging="480"/>
+        <w:tabs>
+          <w:tab w:val="num" w:pos="5040"/>
+        </w:tabs>
+        <w:ind w:left="5520" w:hanging="480"/>
       </w:pPr>
     </w:lvl>
     <w:lvl w:ilvl="8">
@@ -1822,7 +1287,10 @@
       <w:lvlText w:val="•"/>
       <w:lvlJc w:val="left"/>
       <w:pPr>
-        <w:ind w:left="6480" w:hanging="480"/>
+        <w:tabs>
+          <w:tab w:val="num" w:pos="5760"/>
+        </w:tabs>
+        <w:ind w:left="6240" w:hanging="480"/>
       </w:pPr>
     </w:lvl>
   </w:abstractNum>
@@ -1852,10 +1320,10 @@
   <w:docDefaults>
     <w:rPrDefault>
       <w:rPr>
-        <w:rFonts w:asciiTheme="minorHAnsi" w:cstheme="minorBidi" w:eastAsiaTheme="minorHAnsi" w:hAnsiTheme="minorHAnsi"/>
+        <w:rFonts w:asciiTheme="minorHAnsi" w:eastAsiaTheme="minorHAnsi" w:hAnsiTheme="minorHAnsi" w:cstheme="minorBidi"/>
         <w:sz w:val="24"/>
         <w:szCs w:val="24"/>
-        <w:lang w:bidi="ar-SA" w:eastAsia="en-US" w:val="en-US"/>
+        <w:lang w:val="en-US" w:eastAsia="en-US" w:bidi="ar-SA"/>
       </w:rPr>
     </w:rPrDefault>
     <w:pPrDefault>
@@ -1864,35 +1332,35 @@
       </w:pPr>
     </w:pPrDefault>
   </w:docDefaults>
-  <w:latentStyles w:count="276" w:defLockedState="0" w:defQFormat="0" w:defSemiHidden="0" w:defUIPriority="0" w:defUnhideWhenUsed="0"/>
-  <w:style w:default="1" w:styleId="Normal" w:type="paragraph">
+  <w:latentStyles w:defLockedState="0" w:defUIPriority="0" w:defSemiHidden="0" w:defUnhideWhenUsed="0" w:defQFormat="0" w:count="276"/>
+  <w:style w:type="paragraph" w:default="1" w:styleId="Normal">
     <w:name w:val="Normal"/>
     <w:qFormat/>
   </w:style>
-  <w:style w:styleId="BodyText" w:type="paragraph">
+  <w:style w:type="paragraph" w:styleId="BodyText">
     <w:name w:val="Body Text"/>
     <w:basedOn w:val="Normal"/>
     <w:link w:val="BodyTextChar"/>
     <w:pPr>
-      <w:spacing w:after="180" w:before="180"/>
+      <w:spacing w:before="180" w:after="180"/>
     </w:pPr>
     <w:qFormat/>
   </w:style>
-  <w:style w:customStyle="1" w:styleId="FirstParagraph" w:type="paragraph">
+  <w:style w:type="paragraph" w:customStyle="1" w:styleId="FirstParagraph">
     <w:name w:val="First Paragraph"/>
     <w:basedOn w:val="BodyText"/>
     <w:next w:val="BodyText"/>
     <w:qFormat/>
   </w:style>
-  <w:style w:customStyle="1" w:styleId="Compact" w:type="paragraph">
+  <w:style w:type="paragraph" w:customStyle="1" w:styleId="Compact">
     <w:name w:val="Compact"/>
     <w:basedOn w:val="BodyText"/>
     <w:qFormat/>
     <w:pPr>
-      <w:spacing w:after="36" w:before="36"/>
+      <w:spacing w:before="36" w:after="36"/>
     </w:pPr>
   </w:style>
-  <w:style w:styleId="Title" w:type="paragraph">
+  <w:style w:type="paragraph" w:styleId="Title">
     <w:name w:val="Title"/>
     <w:basedOn w:val="Normal"/>
     <w:next w:val="BodyText"/>
@@ -1900,19 +1368,19 @@
     <w:pPr>
       <w:keepNext/>
       <w:keepLines/>
-      <w:spacing w:after="240" w:before="480"/>
+      <w:spacing w:before="480" w:after="240"/>
       <w:jc w:val="center"/>
     </w:pPr>
     <w:rPr>
-      <w:rFonts w:asciiTheme="majorHAnsi" w:cstheme="majorBidi" w:eastAsiaTheme="majorEastAsia" w:hAnsiTheme="majorHAnsi"/>
+      <w:rFonts w:asciiTheme="majorHAnsi" w:eastAsiaTheme="majorEastAsia" w:hAnsiTheme="majorHAnsi" w:cstheme="majorBidi"/>
       <w:b/>
       <w:bCs/>
-      <w:color w:themeColor="accent1" w:themeShade="B5" w:val="345A8A"/>
+      <w:color w:val="345A8A" w:themeColor="accent1" w:themeShade="B5"/>
       <w:sz w:val="36"/>
       <w:szCs w:val="36"/>
     </w:rPr>
   </w:style>
-  <w:style w:styleId="Subtitle" w:type="paragraph">
+  <w:style w:type="paragraph" w:styleId="Subtitle">
     <w:name w:val="Subtitle"/>
     <w:basedOn w:val="Title"/>
     <w:next w:val="BodyText"/>
@@ -1920,7 +1388,7 @@
     <w:pPr>
       <w:keepNext/>
       <w:keepLines/>
-      <w:spacing w:after="240" w:before="240"/>
+      <w:spacing w:before="240" w:after="240"/>
       <w:jc w:val="center"/>
     </w:pPr>
     <w:rPr>
@@ -1928,7 +1396,7 @@
       <w:szCs w:val="30"/>
     </w:rPr>
   </w:style>
-  <w:style w:customStyle="1" w:styleId="Author" w:type="paragraph">
+  <w:style w:type="paragraph" w:customStyle="1" w:styleId="Author">
     <w:name w:val="Author"/>
     <w:next w:val="BodyText"/>
     <w:qFormat/>
@@ -1938,7 +1406,7 @@
       <w:jc w:val="center"/>
     </w:pPr>
   </w:style>
-  <w:style w:styleId="Date" w:type="paragraph">
+  <w:style w:type="paragraph" w:styleId="Date">
     <w:name w:val="Date"/>
     <w:next w:val="BodyText"/>
     <w:qFormat/>
@@ -1948,26 +1416,7 @@
       <w:jc w:val="center"/>
     </w:pPr>
   </w:style>
-  <w:style w:customStyle="1" w:styleId="AbstractTitle" w:type="paragraph">
-    <w:name w:val="Abstract Title"/>
-    <w:basedOn w:val="Normal"/>
-    <w:next w:val="Abstract"/>
-    <w:qFormat/>
-    <w:pPr>
-      <w:keepNext/>
-      <w:keepLines/>
-      <w:jc w:val="center"/>
-      <w:spacing w:after="0" w:before="300"/>
-    </w:pPr>
-    <w:rPr>
-      <w:sz w:val="20"/>
-      <w:szCs w:val="20"/>
-      <w:b/>
-      <w:color w:val="345A8A"/>
-      &gt;
-    </w:rPr>
-  </w:style>
-  <w:style w:customStyle="1" w:styleId="Abstract" w:type="paragraph">
+  <w:style w:type="paragraph" w:customStyle="1" w:styleId="Abstract">
     <w:name w:val="Abstract"/>
     <w:basedOn w:val="Normal"/>
     <w:next w:val="BodyText"/>
@@ -1975,14 +1424,14 @@
     <w:pPr>
       <w:keepNext/>
       <w:keepLines/>
-      <w:spacing w:after="300" w:before="100"/>
+      <w:spacing w:before="300" w:after="300"/>
     </w:pPr>
     <w:rPr>
       <w:sz w:val="20"/>
       <w:szCs w:val="20"/>
     </w:rPr>
   </w:style>
-  <w:style w:styleId="Bibliography" w:type="paragraph">
+  <w:style w:type="paragraph" w:styleId="Bibliography">
     <w:name w:val="Bibliography"/>
     <w:basedOn w:val="Normal"/>
     <w:next w:val="Bibliography"/>
@@ -1990,7 +1439,7 @@
     <w:pPr/>
     <w:rPr/>
   </w:style>
-  <w:style w:styleId="Heading1" w:type="paragraph">
+  <w:style w:type="paragraph" w:styleId="Heading1">
     <w:name w:val="Heading 1"/>
     <w:basedOn w:val="Normal"/>
     <w:next w:val="BodyText"/>
@@ -1999,19 +1448,19 @@
     <w:pPr>
       <w:keepNext/>
       <w:keepLines/>
-      <w:spacing w:after="0" w:before="480"/>
+      <w:spacing w:before="480" w:after="0"/>
       <w:outlineLvl w:val="0"/>
     </w:pPr>
     <w:rPr>
-      <w:rFonts w:asciiTheme="majorHAnsi" w:cstheme="majorBidi" w:eastAsiaTheme="majorEastAsia" w:hAnsiTheme="majorHAnsi"/>
+      <w:rFonts w:asciiTheme="majorHAnsi" w:eastAsiaTheme="majorEastAsia" w:hAnsiTheme="majorHAnsi" w:cstheme="majorBidi"/>
       <w:b/>
       <w:bCs/>
-      <w:color w:themeColor="accent1" w:val="4F81BD"/>
+      <w:color w:val="4F81BD" w:themeColor="accent1"/>
       <w:sz w:val="32"/>
       <w:szCs w:val="32"/>
     </w:rPr>
   </w:style>
-  <w:style w:styleId="Heading2" w:type="paragraph">
+  <w:style w:type="paragraph" w:styleId="Heading2">
     <w:name w:val="Heading 2"/>
     <w:basedOn w:val="Normal"/>
     <w:next w:val="BodyText"/>
@@ -2021,19 +1470,19 @@
     <w:pPr>
       <w:keepNext/>
       <w:keepLines/>
-      <w:spacing w:after="0" w:before="200"/>
+      <w:spacing w:before="200" w:after="0"/>
       <w:outlineLvl w:val="1"/>
     </w:pPr>
     <w:rPr>
-      <w:rFonts w:asciiTheme="majorHAnsi" w:cstheme="majorBidi" w:eastAsiaTheme="majorEastAsia" w:hAnsiTheme="majorHAnsi"/>
+      <w:rFonts w:asciiTheme="majorHAnsi" w:eastAsiaTheme="majorEastAsia" w:hAnsiTheme="majorHAnsi" w:cstheme="majorBidi"/>
       <w:b/>
       <w:bCs/>
-      <w:color w:themeColor="accent1" w:val="4F81BD"/>
+      <w:color w:val="4F81BD" w:themeColor="accent1"/>
       <w:sz w:val="28"/>
       <w:szCs w:val="28"/>
     </w:rPr>
   </w:style>
-  <w:style w:styleId="Heading3" w:type="paragraph">
+  <w:style w:type="paragraph" w:styleId="Heading3">
     <w:name w:val="Heading 3"/>
     <w:basedOn w:val="Normal"/>
     <w:next w:val="BodyText"/>
@@ -2043,19 +1492,19 @@
     <w:pPr>
       <w:keepNext/>
       <w:keepLines/>
-      <w:spacing w:after="0" w:before="200"/>
+      <w:spacing w:before="200" w:after="0"/>
       <w:outlineLvl w:val="2"/>
     </w:pPr>
     <w:rPr>
-      <w:rFonts w:asciiTheme="majorHAnsi" w:cstheme="majorBidi" w:eastAsiaTheme="majorEastAsia" w:hAnsiTheme="majorHAnsi"/>
+      <w:rFonts w:asciiTheme="majorHAnsi" w:eastAsiaTheme="majorEastAsia" w:hAnsiTheme="majorHAnsi" w:cstheme="majorBidi"/>
       <w:b/>
       <w:bCs/>
-      <w:color w:themeColor="accent1" w:val="4F81BD"/>
+      <w:color w:val="4F81BD" w:themeColor="accent1"/>
       <w:sz w:val="24"/>
       <w:szCs w:val="24"/>
     </w:rPr>
   </w:style>
-  <w:style w:styleId="Heading4" w:type="paragraph">
+  <w:style w:type="paragraph" w:styleId="Heading4">
     <w:name w:val="Heading 4"/>
     <w:basedOn w:val="Normal"/>
     <w:next w:val="BodyText"/>
@@ -2065,19 +1514,19 @@
     <w:pPr>
       <w:keepNext/>
       <w:keepLines/>
-      <w:spacing w:after="0" w:before="200"/>
+      <w:spacing w:before="200" w:after="0"/>
       <w:outlineLvl w:val="3"/>
     </w:pPr>
     <w:rPr>
-      <w:rFonts w:asciiTheme="majorHAnsi" w:cstheme="majorBidi" w:eastAsiaTheme="majorEastAsia" w:hAnsiTheme="majorHAnsi"/>
+      <w:rFonts w:asciiTheme="majorHAnsi" w:eastAsiaTheme="majorEastAsia" w:hAnsiTheme="majorHAnsi" w:cstheme="majorBidi"/>
       <w:i/>
       <w:bCs/>
-      <w:color w:themeColor="accent1" w:val="4F81BD"/>
+      <w:color w:val="4F81BD" w:themeColor="accent1"/>
       <w:sz w:val="24"/>
       <w:szCs w:val="24"/>
     </w:rPr>
   </w:style>
-  <w:style w:styleId="Heading5" w:type="paragraph">
+  <w:style w:type="paragraph" w:styleId="Heading5">
     <w:name w:val="Heading 5"/>
     <w:basedOn w:val="Normal"/>
     <w:next w:val="BodyText"/>
@@ -2087,18 +1536,18 @@
     <w:pPr>
       <w:keepNext/>
       <w:keepLines/>
-      <w:spacing w:after="0" w:before="200"/>
+      <w:spacing w:before="200" w:after="0"/>
       <w:outlineLvl w:val="4"/>
     </w:pPr>
     <w:rPr>
-      <w:rFonts w:asciiTheme="majorHAnsi" w:cstheme="majorBidi" w:eastAsiaTheme="majorEastAsia" w:hAnsiTheme="majorHAnsi"/>
+      <w:rFonts w:asciiTheme="majorHAnsi" w:eastAsiaTheme="majorEastAsia" w:hAnsiTheme="majorHAnsi" w:cstheme="majorBidi"/>
       <w:iCs/>
-      <w:color w:themeColor="accent1" w:val="4F81BD"/>
+      <w:color w:val="4F81BD" w:themeColor="accent1"/>
       <w:sz w:val="24"/>
       <w:szCs w:val="24"/>
     </w:rPr>
   </w:style>
-  <w:style w:styleId="Heading6" w:type="paragraph">
+  <w:style w:type="paragraph" w:styleId="Heading6">
     <w:name w:val="Heading 6"/>
     <w:basedOn w:val="Normal"/>
     <w:next w:val="BodyText"/>
@@ -2108,17 +1557,17 @@
     <w:pPr>
       <w:keepNext/>
       <w:keepLines/>
-      <w:spacing w:after="0" w:before="200"/>
+      <w:spacing w:before="200" w:after="0"/>
       <w:outlineLvl w:val="5"/>
     </w:pPr>
     <w:rPr>
-      <w:rFonts w:asciiTheme="majorHAnsi" w:cstheme="majorBidi" w:eastAsiaTheme="majorEastAsia" w:hAnsiTheme="majorHAnsi"/>
-      <w:color w:themeColor="accent1" w:val="4F81BD"/>
+      <w:rFonts w:asciiTheme="majorHAnsi" w:eastAsiaTheme="majorEastAsia" w:hAnsiTheme="majorHAnsi" w:cstheme="majorBidi"/>
+      <w:color w:val="4F81BD" w:themeColor="accent1"/>
       <w:sz w:val="24"/>
       <w:szCs w:val="24"/>
     </w:rPr>
   </w:style>
-  <w:style w:styleId="Heading7" w:type="paragraph">
+  <w:style w:type="paragraph" w:styleId="Heading7">
     <w:name w:val="Heading 7"/>
     <w:basedOn w:val="Normal"/>
     <w:next w:val="BodyText"/>
@@ -2128,17 +1577,17 @@
     <w:pPr>
       <w:keepNext/>
       <w:keepLines/>
-      <w:spacing w:after="0" w:before="200"/>
+      <w:spacing w:before="200" w:after="0"/>
       <w:outlineLvl w:val="6"/>
     </w:pPr>
     <w:rPr>
-      <w:rFonts w:asciiTheme="majorHAnsi" w:cstheme="majorBidi" w:eastAsiaTheme="majorEastAsia" w:hAnsiTheme="majorHAnsi"/>
-      <w:color w:themeColor="accent1" w:val="4F81BD"/>
+      <w:rFonts w:asciiTheme="majorHAnsi" w:eastAsiaTheme="majorEastAsia" w:hAnsiTheme="majorHAnsi" w:cstheme="majorBidi"/>
+      <w:color w:val="4F81BD" w:themeColor="accent1"/>
       <w:sz w:val="24"/>
       <w:szCs w:val="24"/>
     </w:rPr>
   </w:style>
-  <w:style w:styleId="Heading8" w:type="paragraph">
+  <w:style w:type="paragraph" w:styleId="Heading8">
     <w:name w:val="Heading 8"/>
     <w:basedOn w:val="Normal"/>
     <w:next w:val="BodyText"/>
@@ -2148,17 +1597,17 @@
     <w:pPr>
       <w:keepNext/>
       <w:keepLines/>
-      <w:spacing w:after="0" w:before="200"/>
+      <w:spacing w:before="200" w:after="0"/>
       <w:outlineLvl w:val="7"/>
     </w:pPr>
     <w:rPr>
-      <w:rFonts w:asciiTheme="majorHAnsi" w:cstheme="majorBidi" w:eastAsiaTheme="majorEastAsia" w:hAnsiTheme="majorHAnsi"/>
-      <w:color w:themeColor="accent1" w:val="4F81BD"/>
+      <w:rFonts w:asciiTheme="majorHAnsi" w:eastAsiaTheme="majorEastAsia" w:hAnsiTheme="majorHAnsi" w:cstheme="majorBidi"/>
+      <w:color w:val="4F81BD" w:themeColor="accent1"/>
       <w:sz w:val="24"/>
       <w:szCs w:val="24"/>
     </w:rPr>
   </w:style>
-  <w:style w:styleId="Heading9" w:type="paragraph">
+  <w:style w:type="paragraph" w:styleId="Heading9">
     <w:name w:val="Heading 9"/>
     <w:basedOn w:val="Normal"/>
     <w:next w:val="BodyText"/>
@@ -2168,17 +1617,17 @@
     <w:pPr>
       <w:keepNext/>
       <w:keepLines/>
-      <w:spacing w:after="0" w:before="200"/>
+      <w:spacing w:before="200" w:after="0"/>
       <w:outlineLvl w:val="8"/>
     </w:pPr>
     <w:rPr>
-      <w:rFonts w:asciiTheme="majorHAnsi" w:cstheme="majorBidi" w:eastAsiaTheme="majorEastAsia" w:hAnsiTheme="majorHAnsi"/>
-      <w:color w:themeColor="accent1" w:val="4F81BD"/>
+      <w:rFonts w:asciiTheme="majorHAnsi" w:eastAsiaTheme="majorEastAsia" w:hAnsiTheme="majorHAnsi" w:cstheme="majorBidi"/>
+      <w:color w:val="4F81BD" w:themeColor="accent1"/>
       <w:sz w:val="24"/>
       <w:szCs w:val="24"/>
     </w:rPr>
   </w:style>
-  <w:style w:styleId="BlockText" w:type="paragraph">
+  <w:style w:type="paragraph" w:styleId="BlockText">
     <w:name w:val="Block Text"/>
     <w:basedOn w:val="BodyText"/>
     <w:next w:val="BodyText"/>
@@ -2186,11 +1635,11 @@
     <w:unhideWhenUsed/>
     <w:qFormat/>
     <w:pPr>
-      <w:spacing w:after="100" w:before="100"/>
+      <w:spacing w:before="100" w:after="100"/>
       <w:ind w:firstLine="0" w:left="480" w:right="480"/>
     </w:pPr>
   </w:style>
-  <w:style w:styleId="FootnoteText" w:type="paragraph">
+  <w:style w:type="paragraph" w:styleId="FootnoteText">
     <w:name w:val="Footnote Text"/>
     <w:basedOn w:val="Normal"/>
     <w:next w:val="FootnoteText"/>
@@ -2198,43 +1647,28 @@
     <w:unhideWhenUsed/>
     <w:qFormat/>
   </w:style>
-  <w:style w:default="1" w:styleId="DefaultParagraphFont" w:type="character">
+  <w:style w:type="character" w:default="1" w:styleId="DefaultParagraphFont">
     <w:name w:val="Default Paragraph Font"/>
     <w:semiHidden/>
     <w:unhideWhenUsed/>
   </w:style>
-  <w:style w:default="1" w:styleId="Table" w:type="table">
+  <w:style w:type="table" w:default="1" w:styleId="Table">
     <w:name w:val="Table"/>
     <w:basedOn w:val="TableNormal"/>
     <w:semiHidden/>
     <w:unhideWhenUsed/>
     <w:qFormat/>
     <w:tblPr>
-      <w:tblInd w:type="dxa" w:w="0"/>
+      <w:tblInd w:w="0" w:type="dxa"/>
       <w:tblCellMar>
-        <w:top w:type="dxa" w:w="0"/>
-        <w:left w:type="dxa" w:w="108"/>
-        <w:bottom w:type="dxa" w:w="0"/>
-        <w:right w:type="dxa" w:w="108"/>
+        <w:top w:w="0" w:type="dxa"/>
+        <w:left w:w="108" w:type="dxa"/>
+        <w:bottom w:w="0" w:type="dxa"/>
+        <w:right w:w="108" w:type="dxa"/>
       </w:tblCellMar>
     </w:tblPr>
-    <w:tblStylePr w:type="firstRow">
-      <w:tblPr>
-        <w:jc w:val="left"/>
-        <w:tblInd w:type="dxa" w:w="0"/>
-      </w:tblPr>
-      <w:trPr>
-        <w:jc w:val="left"/>
-      </w:trPr>
-      <w:tcPr>
-        <w:vAlign w:val="bottom"/>
-        <w:tcBorders>
-          <w:bottom w:val="single"/>
-        </w:tcBorders>
-      </w:tcPr>
-    </w:tblStylePr>
-  </w:style>
-  <w:style w:customStyle="1" w:styleId="DefinitionTerm" w:type="paragraph">
+  </w:style>
+  <w:style w:type="paragraph" w:customStyle="1" w:styleId="DefinitionTerm">
     <w:name w:val="Definition Term"/>
     <w:basedOn w:val="Normal"/>
     <w:next w:val="Definition"/>
@@ -2247,49 +1681,49 @@
       <w:b/>
     </w:rPr>
   </w:style>
-  <w:style w:customStyle="1" w:styleId="Definition" w:type="paragraph">
+  <w:style w:type="paragraph" w:customStyle="1" w:styleId="Definition">
     <w:name w:val="Definition"/>
     <w:basedOn w:val="Normal"/>
   </w:style>
-  <w:style w:styleId="Caption" w:type="paragraph">
+  <w:style w:type="paragraph" w:styleId="Caption">
     <w:name w:val="Caption"/>
     <w:basedOn w:val="Normal"/>
     <w:link w:val="BodyTextChar"/>
     <w:pPr>
-      <w:spacing w:after="120" w:before="0"/>
+      <w:spacing w:before="0" w:after="120"/>
     </w:pPr>
     <w:rPr>
       <w:i/>
     </w:rPr>
   </w:style>
-  <w:style w:customStyle="1" w:styleId="TableCaption" w:type="paragraph">
+  <w:style w:type="paragraph" w:customStyle="1" w:styleId="TableCaption">
     <w:name w:val="Table Caption"/>
     <w:basedOn w:val="Caption"/>
     <w:pPr>
       <w:keepNext/>
     </w:pPr>
   </w:style>
-  <w:style w:customStyle="1" w:styleId="ImageCaption" w:type="paragraph">
+  <w:style w:type="paragraph" w:customStyle="1" w:styleId="ImageCaption">
     <w:name w:val="Image Caption"/>
     <w:basedOn w:val="Caption"/>
   </w:style>
-  <w:style w:customStyle="1" w:styleId="Figure" w:type="paragraph">
+  <w:style w:type="paragraph" w:customStyle="1" w:styleId="Figure">
     <w:name w:val="Figure"/>
     <w:basedOn w:val="Normal"/>
   </w:style>
-  <w:style w:customStyle="1" w:styleId="CaptionedFigure" w:type="paragraph">
+  <w:style w:type="paragraph" w:customStyle="1" w:styleId="CaptionedFigure">
     <w:name w:val="Captioned Figure"/>
     <w:basedOn w:val="Figure"/>
     <w:pPr>
       <w:keepNext/>
     </w:pPr>
   </w:style>
-  <w:style w:customStyle="1" w:styleId="BodyTextChar" w:type="character">
+  <w:style w:type="character" w:customStyle="1" w:styleId="BodyTextChar">
     <w:name w:val="Body Text Char"/>
     <w:basedOn w:val="DefaultParagraphFont"/>
     <w:link w:val="BodyText"/>
   </w:style>
-  <w:style w:customStyle="1" w:styleId="VerbatimChar" w:type="character">
+  <w:style w:type="character" w:customStyle="1" w:styleId="VerbatimChar">
     <w:name w:val="Verbatim Char"/>
     <w:basedOn w:val="BodyTextChar"/>
     <w:rPr>
@@ -2297,25 +1731,21 @@
       <w:sz w:val="22"/>
     </w:rPr>
   </w:style>
-  <w:style w:customStyle="1" w:styleId="SectionNumber" w:type="character">
-    <w:name w:val="Section Number"/>
-    <w:basedOn w:val="BodyTextChar"/>
-  </w:style>
-  <w:style w:styleId="FootnoteReference" w:type="character">
+  <w:style w:type="character" w:styleId="FootnoteReference">
     <w:name w:val="Footnote Reference"/>
     <w:basedOn w:val="BodyTextChar"/>
     <w:rPr>
       <w:vertAlign w:val="superscript"/>
     </w:rPr>
   </w:style>
-  <w:style w:styleId="Hyperlink" w:type="character">
+  <w:style w:type="character" w:styleId="Hyperlink">
     <w:name w:val="Hyperlink"/>
     <w:basedOn w:val="BodyTextChar"/>
     <w:rPr>
-      <w:color w:themeColor="accent1" w:val="4F81BD"/>
-    </w:rPr>
-  </w:style>
-  <w:style w:styleId="TOCHeading" w:type="paragraph">
+      <w:color w:val="4F81BD" w:themeColor="accent1"/>
+    </w:rPr>
+  </w:style>
+  <w:style w:type="paragraph" w:styleId="TOCHeading">
     <w:name w:val="TOC Heading"/>
     <w:basedOn w:val="Heading1"/>
     <w:next w:val="BodyText"/>
@@ -2327,10 +1757,10 @@
       <w:outlineLvl w:val="9"/>
     </w:pPr>
     <w:rPr>
-      <w:rFonts w:asciiTheme="majorHAnsi" w:cstheme="majorBidi" w:eastAsiaTheme="majorEastAsia" w:hAnsiTheme="majorHAnsi"/>
+      <w:rFonts w:asciiTheme="majorHAnsi" w:eastAsiaTheme="majorEastAsia" w:hAnsiTheme="majorHAnsi" w:cstheme="majorBidi"/>
       <w:b w:val="0"/>
       <w:bCs w:val="0"/>
-      <w:color w:themeColor="accent1" w:themeShade="BF" w:val="365F91"/>
+      <w:color w:val="365F91" w:themeColor="accent1" w:themeShade="BF"/>
     </w:rPr>
   </w:style>
   <w:style w:type="paragraph" w:customStyle="1" w:styleId="SourceCode">
@@ -2422,10 +1852,7 @@
   <w:style w:type="character" w:customStyle="1" w:styleId="ImportTok">
     <w:name w:val="ImportTok"/>
     <w:basedOn w:val="VerbatimChar"/>
-    <w:rPr>
-      <w:color w:val="008000"/>
-      <w:b/>
-    </w:rPr>
+    <w:rPr/>
   </w:style>
   <w:style w:type="character" w:customStyle="1" w:styleId="CommentTok">
     <w:name w:val="CommentTok"/>
@@ -2500,9 +1927,7 @@
   <w:style w:type="character" w:customStyle="1" w:styleId="BuiltInTok">
     <w:name w:val="BuiltInTok"/>
     <w:basedOn w:val="VerbatimChar"/>
-    <w:rPr>
-      <w:color w:val="008000"/>
-    </w:rPr>
+    <w:rPr/>
   </w:style>
   <w:style w:type="character" w:customStyle="1" w:styleId="ExtensionTok">
     <w:name w:val="ExtensionTok"/>

</xml_diff>

<commit_message>
Corrige nome do professor e link no diario
</commit_message>
<xml_diff>
--- a/diario_de_bordo.docx
+++ b/diario_de_bordo.docx
@@ -163,7 +163,7 @@
         <w:t xml:space="preserve"> </w:t>
       </w:r>
       <w:r>
-        <w:t xml:space="preserve">&lt;HELCIO_PADILHA&gt;</w:t>
+        <w:t xml:space="preserve">HELCIO PADILHA</w:t>
       </w:r>
     </w:p>
     <w:p>
@@ -179,42 +179,37 @@
       <w:r>
         <w:t xml:space="preserve"> </w:t>
       </w:r>
-      <w:hyperlink r:id="rId20">
-        <w:r>
-          <w:rPr>
-            <w:rStyle w:val="Hyperlink"/>
-          </w:rPr>
-          <w:t xml:space="preserve">https://github.com/joaovt-ufpr/reservas-equipamentos</w:t>
-        </w:r>
-      </w:hyperlink>
+      <w:r>
+        <w:t xml:space="preserve">https://github.com/joaovt-ufpr/reservas-equipamentos</w:t>
+      </w:r>
     </w:p>
     <w:p>
       <w:pPr>
         <w:pStyle w:val="Heading1"/>
       </w:pPr>
-      <w:bookmarkStart w:id="21" w:name="quem-fez-o-quê"/>
+      <w:bookmarkStart w:id="20" w:name="quem-fez-o-quê"/>
       <w:r>
         <w:t xml:space="preserve">1. Quem fez o quê</w:t>
       </w:r>
+      <w:bookmarkEnd w:id="20"/>
+    </w:p>
+    <w:p>
+      <w:pPr>
+        <w:pStyle w:val="FirstParagraph"/>
+      </w:pPr>
+      <w:r>
+        <w:t xml:space="preserve">O trabalho foi feito por mim, sozinho. Cuidei de todas as partes: o programa em C (menu, listas e funcionalidades), os testes, o README, este diário e o repositório no GitHub.</w:t>
+      </w:r>
+    </w:p>
+    <w:p>
+      <w:pPr>
+        <w:pStyle w:val="Heading1"/>
+      </w:pPr>
+      <w:bookmarkStart w:id="21" w:name="ferramentas-que-usei"/>
+      <w:r>
+        <w:t xml:space="preserve">2. Ferramentas que usei</w:t>
+      </w:r>
       <w:bookmarkEnd w:id="21"/>
-    </w:p>
-    <w:p>
-      <w:pPr>
-        <w:pStyle w:val="FirstParagraph"/>
-      </w:pPr>
-      <w:r>
-        <w:t xml:space="preserve">O trabalho foi feito por mim, sozinho. Cuidei de todas as partes: o programa em C (menu, listas e funcionalidades), os testes, o README, este diário e o repositório no GitHub.</w:t>
-      </w:r>
-    </w:p>
-    <w:p>
-      <w:pPr>
-        <w:pStyle w:val="Heading1"/>
-      </w:pPr>
-      <w:bookmarkStart w:id="22" w:name="ferramentas-que-usei"/>
-      <w:r>
-        <w:t xml:space="preserve">2. Ferramentas que usei</w:t>
-      </w:r>
-      <w:bookmarkEnd w:id="22"/>
     </w:p>
     <w:p>
       <w:pPr>
@@ -256,65 +251,65 @@
       <w:pPr>
         <w:pStyle w:val="Heading1"/>
       </w:pPr>
-      <w:bookmarkStart w:id="23" w:name="como-entendi-o-problema"/>
+      <w:bookmarkStart w:id="22" w:name="como-entendi-o-problema"/>
       <w:r>
         <w:t xml:space="preserve">3. Como entendi o problema</w:t>
       </w:r>
+      <w:bookmarkEnd w:id="22"/>
+    </w:p>
+    <w:p>
+      <w:pPr>
+        <w:pStyle w:val="FirstParagraph"/>
+      </w:pPr>
+      <w:r>
+        <w:t xml:space="preserve">O programa precisa guardar equipamentos (notebook, tablet, câmera, projetor) e as reservas de cada um, sem deixar duas pessoas reservarem o mesmo equipamento no mesmo horário. O histórico precisa ser separado por tipo de equipamento.</w:t>
+      </w:r>
+    </w:p>
+    <w:p>
+      <w:pPr>
+        <w:pStyle w:val="BodyText"/>
+      </w:pPr>
+      <w:r>
+        <w:t xml:space="preserve">Pensei assim: cada tipo tem uma</w:t>
+      </w:r>
+      <w:r>
+        <w:t xml:space="preserve"> </w:t>
+      </w:r>
+      <w:r>
+        <w:t xml:space="preserve">“</w:t>
+      </w:r>
+      <w:r>
+        <w:t xml:space="preserve">ficha</w:t>
+      </w:r>
+      <w:r>
+        <w:t xml:space="preserve">”</w:t>
+      </w:r>
+      <w:r>
+        <w:t xml:space="preserve"> </w:t>
+      </w:r>
+      <w:r>
+        <w:t xml:space="preserve">(o cabeçalho) com o nome do tipo e a contagem de equipamentos e reservas. Presa a essa ficha vêm duas listas: a dos equipamentos daquele tipo e a das reservas daquele tipo. Escolhi lista encadeada porque não sei quantos itens vão existir, e ela vai crescendo conforme eu cadastro.</w:t>
+      </w:r>
+    </w:p>
+    <w:p>
+      <w:pPr>
+        <w:pStyle w:val="Heading1"/>
+      </w:pPr>
+      <w:bookmarkStart w:id="23" w:name="relato-semanal"/>
+      <w:r>
+        <w:t xml:space="preserve">4. Relato semanal</w:t>
+      </w:r>
       <w:bookmarkEnd w:id="23"/>
     </w:p>
     <w:p>
       <w:pPr>
-        <w:pStyle w:val="FirstParagraph"/>
-      </w:pPr>
-      <w:r>
-        <w:t xml:space="preserve">O programa precisa guardar equipamentos (notebook, tablet, câmera, projetor) e as reservas de cada um, sem deixar duas pessoas reservarem o mesmo equipamento no mesmo horário. O histórico precisa ser separado por tipo de equipamento.</w:t>
-      </w:r>
-    </w:p>
-    <w:p>
-      <w:pPr>
-        <w:pStyle w:val="BodyText"/>
-      </w:pPr>
-      <w:r>
-        <w:t xml:space="preserve">Pensei assim: cada tipo tem uma</w:t>
-      </w:r>
-      <w:r>
-        <w:t xml:space="preserve"> </w:t>
-      </w:r>
-      <w:r>
-        <w:t xml:space="preserve">“</w:t>
-      </w:r>
-      <w:r>
-        <w:t xml:space="preserve">ficha</w:t>
-      </w:r>
-      <w:r>
-        <w:t xml:space="preserve">”</w:t>
-      </w:r>
-      <w:r>
-        <w:t xml:space="preserve"> </w:t>
-      </w:r>
-      <w:r>
-        <w:t xml:space="preserve">(o cabeçalho) com o nome do tipo e a contagem de equipamentos e reservas. Presa a essa ficha vêm duas listas: a dos equipamentos daquele tipo e a das reservas daquele tipo. Escolhi lista encadeada porque não sei quantos itens vão existir, e ela vai crescendo conforme eu cadastro.</w:t>
-      </w:r>
-    </w:p>
-    <w:p>
-      <w:pPr>
-        <w:pStyle w:val="Heading1"/>
-      </w:pPr>
-      <w:bookmarkStart w:id="24" w:name="relato-semanal"/>
-      <w:r>
-        <w:t xml:space="preserve">4. Relato semanal</w:t>
+        <w:pStyle w:val="Heading2"/>
+      </w:pPr>
+      <w:bookmarkStart w:id="24" w:name="semana-1"/>
+      <w:r>
+        <w:t xml:space="preserve">Semana 1 —</w:t>
       </w:r>
       <w:bookmarkEnd w:id="24"/>
-    </w:p>
-    <w:p>
-      <w:pPr>
-        <w:pStyle w:val="Heading2"/>
-      </w:pPr>
-      <w:bookmarkStart w:id="25" w:name="semana-1"/>
-      <w:r>
-        <w:t xml:space="preserve">Semana 1 —</w:t>
-      </w:r>
-      <w:bookmarkEnd w:id="25"/>
     </w:p>
     <w:p>
       <w:pPr>
@@ -695,11 +690,11 @@
       <w:pPr>
         <w:pStyle w:val="Heading2"/>
       </w:pPr>
-      <w:bookmarkStart w:id="26" w:name="semana-2"/>
+      <w:bookmarkStart w:id="25" w:name="semana-2"/>
       <w:r>
         <w:t xml:space="preserve">Semana 2 —</w:t>
       </w:r>
-      <w:bookmarkEnd w:id="26"/>
+      <w:bookmarkEnd w:id="25"/>
     </w:p>
     <w:p>
       <w:pPr>
@@ -1026,29 +1021,29 @@
       <w:pPr>
         <w:pStyle w:val="Heading1"/>
       </w:pPr>
-      <w:bookmarkStart w:id="27" w:name="resultado"/>
+      <w:bookmarkStart w:id="26" w:name="resultado"/>
       <w:r>
         <w:t xml:space="preserve">5. Resultado</w:t>
       </w:r>
+      <w:bookmarkEnd w:id="26"/>
+    </w:p>
+    <w:p>
+      <w:pPr>
+        <w:pStyle w:val="FirstParagraph"/>
+      </w:pPr>
+      <w:r>
+        <w:t xml:space="preserve">O programa faz as seis funcionalidades pedidas e foi testado com dados corretos e errados. Ele não salva os dados em arquivo (tudo some quando fecha) e só confere se a data está no formato DD/MM/AAAA.</w:t>
+      </w:r>
+    </w:p>
+    <w:p>
+      <w:pPr>
+        <w:pStyle w:val="Heading1"/>
+      </w:pPr>
+      <w:bookmarkStart w:id="27" w:name="o-que-aprendi"/>
+      <w:r>
+        <w:t xml:space="preserve">6. O que aprendi</w:t>
+      </w:r>
       <w:bookmarkEnd w:id="27"/>
-    </w:p>
-    <w:p>
-      <w:pPr>
-        <w:pStyle w:val="FirstParagraph"/>
-      </w:pPr>
-      <w:r>
-        <w:t xml:space="preserve">O programa faz as seis funcionalidades pedidas e foi testado com dados corretos e errados. Ele não salva os dados em arquivo (tudo some quando fecha) e só confere se a data está no formato DD/MM/AAAA.</w:t>
-      </w:r>
-    </w:p>
-    <w:p>
-      <w:pPr>
-        <w:pStyle w:val="Heading1"/>
-      </w:pPr>
-      <w:bookmarkStart w:id="28" w:name="o-que-aprendi"/>
-      <w:r>
-        <w:t xml:space="preserve">6. O que aprendi</w:t>
-      </w:r>
-      <w:bookmarkEnd w:id="28"/>
     </w:p>
     <w:p>
       <w:pPr>

</xml_diff>